<commit_message>
Agregar capturas al manual funcional
</commit_message>
<xml_diff>
--- a/docs/manuales/Manual_Funcional_Usuario_Final_Control_Aduanero_FD.docx
+++ b/docs/manuales/Manual_Funcional_Usuario_Final_Control_Aduanero_FD.docx
@@ -411,6 +411,728 @@
       </w:pPr>
       <w:r>
         <w:t>Verificar que el boton Agregar consolidado quede bloqueado.</w:t>
+      </w:r>
+    </w:p>
+    <w:p>
+      <w:pPr>
+        <w:pStyle w:val="Heading1"/>
+      </w:pPr>
+      <w:r>
+        <w:t>Paso a paso con capturas</w:t>
+      </w:r>
+    </w:p>
+    <w:tbl>
+      <w:tblPr>
+        <w:tblStyle w:val="TableGrid"/>
+        <w:tblW w:type="auto" w:w="0"/>
+        <w:tblLayout w:type="fixed"/>
+        <w:tblLook w:firstColumn="1" w:firstRow="1" w:lastColumn="0" w:lastRow="0" w:noHBand="0" w:noVBand="1" w:val="04A0"/>
+      </w:tblPr>
+      <w:tblGrid>
+        <w:gridCol w:w="9360"/>
+      </w:tblGrid>
+      <w:tr>
+        <w:tc>
+          <w:tcPr>
+            <w:tcW w:type="dxa" w:w="9360"/>
+            <w:tcMar>
+              <w:top w:w="80" w:type="dxa"/>
+              <w:start w:w="120" w:type="dxa"/>
+              <w:bottom w:w="80" w:type="dxa"/>
+              <w:end w:w="120" w:type="dxa"/>
+            </w:tcMar>
+            <w:vAlign w:val="center"/>
+            <w:shd w:fill="F4F6F9"/>
+          </w:tcPr>
+          <w:p>
+            <w:r/>
+            <w:r>
+              <w:rPr>
+                <w:b/>
+                <w:color w:val="1F4D78"/>
+                <w:sz w:val="20"/>
+              </w:rPr>
+              <w:t xml:space="preserve">Origen de capturas: </w:t>
+            </w:r>
+            <w:r>
+              <w:rPr>
+                <w:sz w:val="20"/>
+              </w:rPr>
+              <w:t>Las imagenes de esta seccion provienen de la ultima ejecucion local del marcador flujo_completo en Allure.</w:t>
+            </w:r>
+          </w:p>
+        </w:tc>
+      </w:tr>
+    </w:tbl>
+    <w:p/>
+    <w:p>
+      <w:pPr>
+        <w:pStyle w:val="Heading3"/>
+      </w:pPr>
+      <w:r>
+        <w:t>1. Acceso al sistema</w:t>
+      </w:r>
+    </w:p>
+    <w:p>
+      <w:pPr>
+        <w:keepNext/>
+      </w:pPr>
+      <w:r>
+        <w:t>Ingresar al sistema y seleccionar el pais de trabajo antes de iniciar sesion.</w:t>
+      </w:r>
+    </w:p>
+    <w:p>
+      <w:pPr>
+        <w:jc w:val="center"/>
+      </w:pPr>
+      <w:r>
+        <w:drawing>
+          <wp:inline xmlns:a="http://schemas.openxmlformats.org/drawingml/2006/main" xmlns:pic="http://schemas.openxmlformats.org/drawingml/2006/picture">
+            <wp:extent cx="5577840" cy="2765582"/>
+            <wp:docPr id="1" name="Picture 1"/>
+            <wp:cNvGraphicFramePr>
+              <a:graphicFrameLocks noChangeAspect="1"/>
+            </wp:cNvGraphicFramePr>
+            <a:graphic>
+              <a:graphicData uri="http://schemas.openxmlformats.org/drawingml/2006/picture">
+                <pic:pic>
+                  <pic:nvPicPr>
+                    <pic:cNvPr id="0" name="49d8c480-ab70-4ca6-816c-442182b5223d-attachment.png"/>
+                    <pic:cNvPicPr/>
+                  </pic:nvPicPr>
+                  <pic:blipFill>
+                    <a:blip r:embed="rId11"/>
+                    <a:stretch>
+                      <a:fillRect/>
+                    </a:stretch>
+                  </pic:blipFill>
+                  <pic:spPr>
+                    <a:xfrm>
+                      <a:off x="0" y="0"/>
+                      <a:ext cx="5577840" cy="2765582"/>
+                    </a:xfrm>
+                    <a:prstGeom prst="rect"/>
+                  </pic:spPr>
+                </pic:pic>
+              </a:graphicData>
+            </a:graphic>
+          </wp:inline>
+        </w:drawing>
+      </w:r>
+    </w:p>
+    <w:p>
+      <w:pPr>
+        <w:jc w:val="center"/>
+      </w:pPr>
+      <w:r>
+        <w:rPr>
+          <w:color w:val="5A636E"/>
+          <w:sz w:val="16"/>
+        </w:rPr>
+        <w:t>Captura: 49d8c480-ab70-4ca6-816c-442182b5223d-attachment.png</w:t>
+      </w:r>
+    </w:p>
+    <w:p>
+      <w:pPr>
+        <w:pStyle w:val="Heading3"/>
+      </w:pPr>
+      <w:r>
+        <w:t>2. Formulario de guia madre</w:t>
+      </w:r>
+    </w:p>
+    <w:p>
+      <w:pPr>
+        <w:keepNext/>
+      </w:pPr>
+      <w:r>
+        <w:t>Abrir Agregar guia madre y completar los campos requeridos del manifiesto.</w:t>
+      </w:r>
+    </w:p>
+    <w:p>
+      <w:pPr>
+        <w:jc w:val="center"/>
+      </w:pPr>
+      <w:r>
+        <w:drawing>
+          <wp:inline xmlns:a="http://schemas.openxmlformats.org/drawingml/2006/main" xmlns:pic="http://schemas.openxmlformats.org/drawingml/2006/picture">
+            <wp:extent cx="5577840" cy="2765582"/>
+            <wp:docPr id="2" name="Picture 2"/>
+            <wp:cNvGraphicFramePr>
+              <a:graphicFrameLocks noChangeAspect="1"/>
+            </wp:cNvGraphicFramePr>
+            <a:graphic>
+              <a:graphicData uri="http://schemas.openxmlformats.org/drawingml/2006/picture">
+                <pic:pic>
+                  <pic:nvPicPr>
+                    <pic:cNvPr id="0" name="489d48d8-fdfa-4e9b-bab6-9542357170c3-attachment.png"/>
+                    <pic:cNvPicPr/>
+                  </pic:nvPicPr>
+                  <pic:blipFill>
+                    <a:blip r:embed="rId12"/>
+                    <a:stretch>
+                      <a:fillRect/>
+                    </a:stretch>
+                  </pic:blipFill>
+                  <pic:spPr>
+                    <a:xfrm>
+                      <a:off x="0" y="0"/>
+                      <a:ext cx="5577840" cy="2765582"/>
+                    </a:xfrm>
+                    <a:prstGeom prst="rect"/>
+                  </pic:spPr>
+                </pic:pic>
+              </a:graphicData>
+            </a:graphic>
+          </wp:inline>
+        </w:drawing>
+      </w:r>
+    </w:p>
+    <w:p>
+      <w:pPr>
+        <w:jc w:val="center"/>
+      </w:pPr>
+      <w:r>
+        <w:rPr>
+          <w:color w:val="5A636E"/>
+          <w:sz w:val="16"/>
+        </w:rPr>
+        <w:t>Captura: 489d48d8-fdfa-4e9b-bab6-9542357170c3-attachment.png</w:t>
+      </w:r>
+    </w:p>
+    <w:p>
+      <w:pPr>
+        <w:pStyle w:val="Heading3"/>
+      </w:pPr>
+      <w:r>
+        <w:t>3. Guia madre creada</w:t>
+      </w:r>
+    </w:p>
+    <w:p>
+      <w:pPr>
+        <w:keepNext/>
+      </w:pPr>
+      <w:r>
+        <w:t>Confirmar el mensaje de creacion exitosa y validar que la guia aparece en el listado.</w:t>
+      </w:r>
+    </w:p>
+    <w:p>
+      <w:pPr>
+        <w:jc w:val="center"/>
+      </w:pPr>
+      <w:r>
+        <w:drawing>
+          <wp:inline xmlns:a="http://schemas.openxmlformats.org/drawingml/2006/main" xmlns:pic="http://schemas.openxmlformats.org/drawingml/2006/picture">
+            <wp:extent cx="5577840" cy="2765582"/>
+            <wp:docPr id="3" name="Picture 3"/>
+            <wp:cNvGraphicFramePr>
+              <a:graphicFrameLocks noChangeAspect="1"/>
+            </wp:cNvGraphicFramePr>
+            <a:graphic>
+              <a:graphicData uri="http://schemas.openxmlformats.org/drawingml/2006/picture">
+                <pic:pic>
+                  <pic:nvPicPr>
+                    <pic:cNvPr id="0" name="f4abf15f-c5ea-4c75-a00a-564a3406308f-attachment.png"/>
+                    <pic:cNvPicPr/>
+                  </pic:nvPicPr>
+                  <pic:blipFill>
+                    <a:blip r:embed="rId13"/>
+                    <a:stretch>
+                      <a:fillRect/>
+                    </a:stretch>
+                  </pic:blipFill>
+                  <pic:spPr>
+                    <a:xfrm>
+                      <a:off x="0" y="0"/>
+                      <a:ext cx="5577840" cy="2765582"/>
+                    </a:xfrm>
+                    <a:prstGeom prst="rect"/>
+                  </pic:spPr>
+                </pic:pic>
+              </a:graphicData>
+            </a:graphic>
+          </wp:inline>
+        </w:drawing>
+      </w:r>
+    </w:p>
+    <w:p>
+      <w:pPr>
+        <w:jc w:val="center"/>
+      </w:pPr>
+      <w:r>
+        <w:rPr>
+          <w:color w:val="5A636E"/>
+          <w:sz w:val="16"/>
+        </w:rPr>
+        <w:t>Captura: f4abf15f-c5ea-4c75-a00a-564a3406308f-attachment.png</w:t>
+      </w:r>
+    </w:p>
+    <w:p>
+      <w:pPr>
+        <w:pStyle w:val="Heading3"/>
+      </w:pPr>
+      <w:r>
+        <w:t>4. Estado Arribo al pais</w:t>
+      </w:r>
+    </w:p>
+    <w:p>
+      <w:pPr>
+        <w:keepNext/>
+      </w:pPr>
+      <w:r>
+        <w:t>Verificar que la guia madre creada inicia en el estado Arribo al pais.</w:t>
+      </w:r>
+    </w:p>
+    <w:p>
+      <w:pPr>
+        <w:jc w:val="center"/>
+      </w:pPr>
+      <w:r>
+        <w:drawing>
+          <wp:inline xmlns:a="http://schemas.openxmlformats.org/drawingml/2006/main" xmlns:pic="http://schemas.openxmlformats.org/drawingml/2006/picture">
+            <wp:extent cx="5577840" cy="2765582"/>
+            <wp:docPr id="4" name="Picture 4"/>
+            <wp:cNvGraphicFramePr>
+              <a:graphicFrameLocks noChangeAspect="1"/>
+            </wp:cNvGraphicFramePr>
+            <a:graphic>
+              <a:graphicData uri="http://schemas.openxmlformats.org/drawingml/2006/picture">
+                <pic:pic>
+                  <pic:nvPicPr>
+                    <pic:cNvPr id="0" name="534d1128-194f-4e28-8d28-e19b66710204-attachment.png"/>
+                    <pic:cNvPicPr/>
+                  </pic:nvPicPr>
+                  <pic:blipFill>
+                    <a:blip r:embed="rId14"/>
+                    <a:stretch>
+                      <a:fillRect/>
+                    </a:stretch>
+                  </pic:blipFill>
+                  <pic:spPr>
+                    <a:xfrm>
+                      <a:off x="0" y="0"/>
+                      <a:ext cx="5577840" cy="2765582"/>
+                    </a:xfrm>
+                    <a:prstGeom prst="rect"/>
+                  </pic:spPr>
+                </pic:pic>
+              </a:graphicData>
+            </a:graphic>
+          </wp:inline>
+        </w:drawing>
+      </w:r>
+    </w:p>
+    <w:p>
+      <w:pPr>
+        <w:jc w:val="center"/>
+      </w:pPr>
+      <w:r>
+        <w:rPr>
+          <w:color w:val="5A636E"/>
+          <w:sz w:val="16"/>
+        </w:rPr>
+        <w:t>Captura: 534d1128-194f-4e28-8d28-e19b66710204-attachment.png</w:t>
+      </w:r>
+    </w:p>
+    <w:p>
+      <w:pPr>
+        <w:pStyle w:val="Heading3"/>
+      </w:pPr>
+      <w:r>
+        <w:t>5. Entrega a aduana</w:t>
+      </w:r>
+    </w:p>
+    <w:p>
+      <w:pPr>
+        <w:keepNext/>
+      </w:pPr>
+      <w:r>
+        <w:t>Ejecutar Entregar a aduana y confirmar el cambio de estado.</w:t>
+      </w:r>
+    </w:p>
+    <w:p>
+      <w:pPr>
+        <w:jc w:val="center"/>
+      </w:pPr>
+      <w:r>
+        <w:drawing>
+          <wp:inline xmlns:a="http://schemas.openxmlformats.org/drawingml/2006/main" xmlns:pic="http://schemas.openxmlformats.org/drawingml/2006/picture">
+            <wp:extent cx="5577840" cy="2765582"/>
+            <wp:docPr id="5" name="Picture 5"/>
+            <wp:cNvGraphicFramePr>
+              <a:graphicFrameLocks noChangeAspect="1"/>
+            </wp:cNvGraphicFramePr>
+            <a:graphic>
+              <a:graphicData uri="http://schemas.openxmlformats.org/drawingml/2006/picture">
+                <pic:pic>
+                  <pic:nvPicPr>
+                    <pic:cNvPr id="0" name="732c18f2-4506-4447-8be2-b74fb25790f8-attachment.png"/>
+                    <pic:cNvPicPr/>
+                  </pic:nvPicPr>
+                  <pic:blipFill>
+                    <a:blip r:embed="rId15"/>
+                    <a:stretch>
+                      <a:fillRect/>
+                    </a:stretch>
+                  </pic:blipFill>
+                  <pic:spPr>
+                    <a:xfrm>
+                      <a:off x="0" y="0"/>
+                      <a:ext cx="5577840" cy="2765582"/>
+                    </a:xfrm>
+                    <a:prstGeom prst="rect"/>
+                  </pic:spPr>
+                </pic:pic>
+              </a:graphicData>
+            </a:graphic>
+          </wp:inline>
+        </w:drawing>
+      </w:r>
+    </w:p>
+    <w:p>
+      <w:pPr>
+        <w:jc w:val="center"/>
+      </w:pPr>
+      <w:r>
+        <w:rPr>
+          <w:color w:val="5A636E"/>
+          <w:sz w:val="16"/>
+        </w:rPr>
+        <w:t>Captura: 732c18f2-4506-4447-8be2-b74fb25790f8-attachment.png</w:t>
+      </w:r>
+    </w:p>
+    <w:p>
+      <w:pPr>
+        <w:pStyle w:val="Heading3"/>
+      </w:pPr>
+      <w:r>
+        <w:t>6. Estado Arribo a aduana</w:t>
+      </w:r>
+    </w:p>
+    <w:p>
+      <w:pPr>
+        <w:keepNext/>
+      </w:pPr>
+      <w:r>
+        <w:t>Validar que la guia madre queda disponible para carga de consolidados.</w:t>
+      </w:r>
+    </w:p>
+    <w:p>
+      <w:pPr>
+        <w:jc w:val="center"/>
+      </w:pPr>
+      <w:r>
+        <w:drawing>
+          <wp:inline xmlns:a="http://schemas.openxmlformats.org/drawingml/2006/main" xmlns:pic="http://schemas.openxmlformats.org/drawingml/2006/picture">
+            <wp:extent cx="5577840" cy="2765582"/>
+            <wp:docPr id="6" name="Picture 6"/>
+            <wp:cNvGraphicFramePr>
+              <a:graphicFrameLocks noChangeAspect="1"/>
+            </wp:cNvGraphicFramePr>
+            <a:graphic>
+              <a:graphicData uri="http://schemas.openxmlformats.org/drawingml/2006/picture">
+                <pic:pic>
+                  <pic:nvPicPr>
+                    <pic:cNvPr id="0" name="15927ca2-cfd3-479d-bf77-d6afde160352-attachment.png"/>
+                    <pic:cNvPicPr/>
+                  </pic:nvPicPr>
+                  <pic:blipFill>
+                    <a:blip r:embed="rId16"/>
+                    <a:stretch>
+                      <a:fillRect/>
+                    </a:stretch>
+                  </pic:blipFill>
+                  <pic:spPr>
+                    <a:xfrm>
+                      <a:off x="0" y="0"/>
+                      <a:ext cx="5577840" cy="2765582"/>
+                    </a:xfrm>
+                    <a:prstGeom prst="rect"/>
+                  </pic:spPr>
+                </pic:pic>
+              </a:graphicData>
+            </a:graphic>
+          </wp:inline>
+        </w:drawing>
+      </w:r>
+    </w:p>
+    <w:p>
+      <w:pPr>
+        <w:jc w:val="center"/>
+      </w:pPr>
+      <w:r>
+        <w:rPr>
+          <w:color w:val="5A636E"/>
+          <w:sz w:val="16"/>
+        </w:rPr>
+        <w:t>Captura: 15927ca2-cfd3-479d-bf77-d6afde160352-attachment.png</w:t>
+      </w:r>
+    </w:p>
+    <w:p>
+      <w:pPr>
+        <w:pStyle w:val="Heading3"/>
+      </w:pPr>
+      <w:r>
+        <w:t>7. Carga de consolidado</w:t>
+      </w:r>
+    </w:p>
+    <w:p>
+      <w:pPr>
+        <w:keepNext/>
+      </w:pPr>
+      <w:r>
+        <w:t>Cargar los archivos de selectivo Verde, Rojo y Amarillo en la guia madre.</w:t>
+      </w:r>
+    </w:p>
+    <w:p>
+      <w:pPr>
+        <w:jc w:val="center"/>
+      </w:pPr>
+      <w:r>
+        <w:drawing>
+          <wp:inline xmlns:a="http://schemas.openxmlformats.org/drawingml/2006/main" xmlns:pic="http://schemas.openxmlformats.org/drawingml/2006/picture">
+            <wp:extent cx="5577840" cy="2765582"/>
+            <wp:docPr id="7" name="Picture 7"/>
+            <wp:cNvGraphicFramePr>
+              <a:graphicFrameLocks noChangeAspect="1"/>
+            </wp:cNvGraphicFramePr>
+            <a:graphic>
+              <a:graphicData uri="http://schemas.openxmlformats.org/drawingml/2006/picture">
+                <pic:pic>
+                  <pic:nvPicPr>
+                    <pic:cNvPr id="0" name="13e141a8-9815-42f0-a146-c96a9ed26450-attachment.png"/>
+                    <pic:cNvPicPr/>
+                  </pic:nvPicPr>
+                  <pic:blipFill>
+                    <a:blip r:embed="rId17"/>
+                    <a:stretch>
+                      <a:fillRect/>
+                    </a:stretch>
+                  </pic:blipFill>
+                  <pic:spPr>
+                    <a:xfrm>
+                      <a:off x="0" y="0"/>
+                      <a:ext cx="5577840" cy="2765582"/>
+                    </a:xfrm>
+                    <a:prstGeom prst="rect"/>
+                  </pic:spPr>
+                </pic:pic>
+              </a:graphicData>
+            </a:graphic>
+          </wp:inline>
+        </w:drawing>
+      </w:r>
+    </w:p>
+    <w:p>
+      <w:pPr>
+        <w:jc w:val="center"/>
+      </w:pPr>
+      <w:r>
+        <w:rPr>
+          <w:color w:val="5A636E"/>
+          <w:sz w:val="16"/>
+        </w:rPr>
+        <w:t>Captura: 13e141a8-9815-42f0-a146-c96a9ed26450-attachment.png</w:t>
+      </w:r>
+    </w:p>
+    <w:p>
+      <w:pPr>
+        <w:pStyle w:val="Heading3"/>
+      </w:pPr>
+      <w:r>
+        <w:t>8. Estado Carga de selectivos</w:t>
+      </w:r>
+    </w:p>
+    <w:p>
+      <w:pPr>
+        <w:keepNext/>
+      </w:pPr>
+      <w:r>
+        <w:t>Confirmar que la guia madre cambia a Carga de selectivos despues de cargar consolidados.</w:t>
+      </w:r>
+    </w:p>
+    <w:p>
+      <w:pPr>
+        <w:jc w:val="center"/>
+      </w:pPr>
+      <w:r>
+        <w:drawing>
+          <wp:inline xmlns:a="http://schemas.openxmlformats.org/drawingml/2006/main" xmlns:pic="http://schemas.openxmlformats.org/drawingml/2006/picture">
+            <wp:extent cx="5577840" cy="2765582"/>
+            <wp:docPr id="8" name="Picture 8"/>
+            <wp:cNvGraphicFramePr>
+              <a:graphicFrameLocks noChangeAspect="1"/>
+            </wp:cNvGraphicFramePr>
+            <a:graphic>
+              <a:graphicData uri="http://schemas.openxmlformats.org/drawingml/2006/picture">
+                <pic:pic>
+                  <pic:nvPicPr>
+                    <pic:cNvPr id="0" name="1136b5dc-85b8-43d7-bf59-e88bcd0a4b08-attachment.png"/>
+                    <pic:cNvPicPr/>
+                  </pic:nvPicPr>
+                  <pic:blipFill>
+                    <a:blip r:embed="rId18"/>
+                    <a:stretch>
+                      <a:fillRect/>
+                    </a:stretch>
+                  </pic:blipFill>
+                  <pic:spPr>
+                    <a:xfrm>
+                      <a:off x="0" y="0"/>
+                      <a:ext cx="5577840" cy="2765582"/>
+                    </a:xfrm>
+                    <a:prstGeom prst="rect"/>
+                  </pic:spPr>
+                </pic:pic>
+              </a:graphicData>
+            </a:graphic>
+          </wp:inline>
+        </w:drawing>
+      </w:r>
+    </w:p>
+    <w:p>
+      <w:pPr>
+        <w:jc w:val="center"/>
+      </w:pPr>
+      <w:r>
+        <w:rPr>
+          <w:color w:val="5A636E"/>
+          <w:sz w:val="16"/>
+        </w:rPr>
+        <w:t>Captura: 1136b5dc-85b8-43d7-bf59-e88bcd0a4b08-attachment.png</w:t>
+      </w:r>
+    </w:p>
+    <w:p>
+      <w:pPr>
+        <w:pStyle w:val="Heading3"/>
+      </w:pPr>
+      <w:r>
+        <w:t>9. Despacho de cajas</w:t>
+      </w:r>
+    </w:p>
+    <w:p>
+      <w:pPr>
+        <w:keepNext/>
+      </w:pPr>
+      <w:r>
+        <w:t>Entrar al detalle del consolidado y ejecutar el despacho de cajas.</w:t>
+      </w:r>
+    </w:p>
+    <w:p>
+      <w:pPr>
+        <w:jc w:val="center"/>
+      </w:pPr>
+      <w:r>
+        <w:drawing>
+          <wp:inline xmlns:a="http://schemas.openxmlformats.org/drawingml/2006/main" xmlns:pic="http://schemas.openxmlformats.org/drawingml/2006/picture">
+            <wp:extent cx="5577840" cy="2765582"/>
+            <wp:docPr id="9" name="Picture 9"/>
+            <wp:cNvGraphicFramePr>
+              <a:graphicFrameLocks noChangeAspect="1"/>
+            </wp:cNvGraphicFramePr>
+            <a:graphic>
+              <a:graphicData uri="http://schemas.openxmlformats.org/drawingml/2006/picture">
+                <pic:pic>
+                  <pic:nvPicPr>
+                    <pic:cNvPr id="0" name="dfb0b0f3-a6ea-4cec-9a11-a6807657504b-attachment.png"/>
+                    <pic:cNvPicPr/>
+                  </pic:nvPicPr>
+                  <pic:blipFill>
+                    <a:blip r:embed="rId19"/>
+                    <a:stretch>
+                      <a:fillRect/>
+                    </a:stretch>
+                  </pic:blipFill>
+                  <pic:spPr>
+                    <a:xfrm>
+                      <a:off x="0" y="0"/>
+                      <a:ext cx="5577840" cy="2765582"/>
+                    </a:xfrm>
+                    <a:prstGeom prst="rect"/>
+                  </pic:spPr>
+                </pic:pic>
+              </a:graphicData>
+            </a:graphic>
+          </wp:inline>
+        </w:drawing>
+      </w:r>
+    </w:p>
+    <w:p>
+      <w:pPr>
+        <w:jc w:val="center"/>
+      </w:pPr>
+      <w:r>
+        <w:rPr>
+          <w:color w:val="5A636E"/>
+          <w:sz w:val="16"/>
+        </w:rPr>
+        <w:t>Captura: dfb0b0f3-a6ea-4cec-9a11-a6807657504b-attachment.png</w:t>
+      </w:r>
+    </w:p>
+    <w:p>
+      <w:pPr>
+        <w:pStyle w:val="Heading3"/>
+      </w:pPr>
+      <w:r>
+        <w:t>10. Estado Completado y bloqueo</w:t>
+      </w:r>
+    </w:p>
+    <w:p>
+      <w:pPr>
+        <w:keepNext/>
+      </w:pPr>
+      <w:r>
+        <w:t>Confirmar que la guia madre queda Completado y que Agregar consolidado queda bloqueado.</w:t>
+      </w:r>
+    </w:p>
+    <w:p>
+      <w:pPr>
+        <w:jc w:val="center"/>
+      </w:pPr>
+      <w:r>
+        <w:drawing>
+          <wp:inline xmlns:a="http://schemas.openxmlformats.org/drawingml/2006/main" xmlns:pic="http://schemas.openxmlformats.org/drawingml/2006/picture">
+            <wp:extent cx="5577840" cy="2765582"/>
+            <wp:docPr id="10" name="Picture 10"/>
+            <wp:cNvGraphicFramePr>
+              <a:graphicFrameLocks noChangeAspect="1"/>
+            </wp:cNvGraphicFramePr>
+            <a:graphic>
+              <a:graphicData uri="http://schemas.openxmlformats.org/drawingml/2006/picture">
+                <pic:pic>
+                  <pic:nvPicPr>
+                    <pic:cNvPr id="0" name="11308cf6-99ab-4736-a76d-28f42958f74f-attachment.png"/>
+                    <pic:cNvPicPr/>
+                  </pic:nvPicPr>
+                  <pic:blipFill>
+                    <a:blip r:embed="rId20"/>
+                    <a:stretch>
+                      <a:fillRect/>
+                    </a:stretch>
+                  </pic:blipFill>
+                  <pic:spPr>
+                    <a:xfrm>
+                      <a:off x="0" y="0"/>
+                      <a:ext cx="5577840" cy="2765582"/>
+                    </a:xfrm>
+                    <a:prstGeom prst="rect"/>
+                  </pic:spPr>
+                </pic:pic>
+              </a:graphicData>
+            </a:graphic>
+          </wp:inline>
+        </w:drawing>
+      </w:r>
+    </w:p>
+    <w:p>
+      <w:pPr>
+        <w:jc w:val="center"/>
+      </w:pPr>
+      <w:r>
+        <w:rPr>
+          <w:color w:val="5A636E"/>
+          <w:sz w:val="16"/>
+        </w:rPr>
+        <w:t>Captura: 11308cf6-99ab-4736-a76d-28f42958f74f-attachment.png</w:t>
       </w:r>
     </w:p>
     <w:p>

</xml_diff>